<commit_message>
Save all pending Nupia corporate, Studio, briefing and template changes
</commit_message>
<xml_diff>
--- a/nupia_studio/briefings/briefing-boda-adrian-gema.docx
+++ b/nupia_studio/briefings/briefing-boda-adrian-gema.docx
@@ -2168,6 +2168,86 @@
           </w:p>
         </w:tc>
       </w:tr>
+      <w:tr>
+        <w:tc>
+          <w:tcPr>
+            <w:tcW w:type="dxa" w:w="2952"/>
+            <w:vAlign w:val="center"/>
+            <w:tcMar>
+              <w:top w:w="80" w:type="dxa"/>
+              <w:bottom w:w="80" w:type="dxa"/>
+              <w:start w:w="120" w:type="dxa"/>
+              <w:end w:w="120" w:type="dxa"/>
+            </w:tcMar>
+          </w:tcPr>
+          <w:p>
+            <w:pPr>
+              <w:spacing w:after="0"/>
+            </w:pPr>
+            <w:r>
+              <w:rPr>
+                <w:rFonts w:ascii="Aptos" w:hAnsi="Aptos"/>
+                <w:b/>
+                <w:color w:val="173E2F"/>
+                <w:sz w:val="19"/>
+              </w:rPr>
+              <w:t>Redondeado</w:t>
+            </w:r>
+          </w:p>
+        </w:tc>
+        <w:tc>
+          <w:tcPr>
+            <w:tcW w:type="dxa" w:w="5112"/>
+            <w:vAlign w:val="center"/>
+            <w:tcMar>
+              <w:top w:w="80" w:type="dxa"/>
+              <w:bottom w:w="80" w:type="dxa"/>
+              <w:start w:w="120" w:type="dxa"/>
+              <w:end w:w="120" w:type="dxa"/>
+            </w:tcMar>
+          </w:tcPr>
+          <w:p>
+            <w:pPr>
+              <w:spacing w:after="0"/>
+            </w:pPr>
+            <w:r>
+              <w:rPr>
+                <w:rFonts w:ascii="Aptos" w:hAnsi="Aptos"/>
+                <w:b w:val="0"/>
+                <w:color w:val="173E2F"/>
+                <w:sz w:val="19"/>
+              </w:rPr>
+              <w:t>12</w:t>
+            </w:r>
+          </w:p>
+        </w:tc>
+        <w:tc>
+          <w:tcPr>
+            <w:tcW w:type="dxa" w:w="1296"/>
+            <w:vAlign w:val="center"/>
+            <w:tcMar>
+              <w:top w:w="80" w:type="dxa"/>
+              <w:bottom w:w="80" w:type="dxa"/>
+              <w:start w:w="120" w:type="dxa"/>
+              <w:end w:w="120" w:type="dxa"/>
+            </w:tcMar>
+          </w:tcPr>
+          <w:p>
+            <w:pPr>
+              <w:spacing w:after="0"/>
+            </w:pPr>
+            <w:r>
+              <w:rPr>
+                <w:rFonts w:ascii="Aptos" w:hAnsi="Aptos"/>
+                <w:b w:val="0"/>
+                <w:color w:val="6D8477"/>
+                <w:sz w:val="16"/>
+              </w:rPr>
+              <w:t>theme.radius</w:t>
+            </w:r>
+          </w:p>
+        </w:tc>
+      </w:tr>
     </w:tbl>
     <w:p>
       <w:pPr>

</xml_diff>